<commit_message>
Economics + AI working
</commit_message>
<xml_diff>
--- a/DETAILED STRUCTURE_updated.docx
+++ b/DETAILED STRUCTURE_updated.docx
@@ -132,70 +132,7 @@
           <w:i/>
           <w:iCs/>
         </w:rPr>
-        <w:t>S</w:t>
-      </w:r>
-      <w:r>
-        <w:rPr>
-          <w:b/>
-          <w:bCs/>
-          <w:i/>
-          <w:iCs/>
-        </w:rPr>
-        <w:t>ystem should be</w:t>
-      </w:r>
-      <w:r>
-        <w:rPr>
-          <w:b/>
-          <w:bCs/>
-          <w:i/>
-          <w:iCs/>
-        </w:rPr>
-        <w:t xml:space="preserve"> s</w:t>
-      </w:r>
-      <w:r>
-        <w:rPr>
-          <w:b/>
-          <w:bCs/>
-          <w:i/>
-          <w:iCs/>
-        </w:rPr>
-        <w:t>tateless</w:t>
-      </w:r>
-      <w:r>
-        <w:rPr>
-          <w:b/>
-          <w:bCs/>
-          <w:i/>
-          <w:iCs/>
-        </w:rPr>
-        <w:t xml:space="preserve">: </w:t>
-      </w:r>
-      <w:r>
-        <w:rPr>
-          <w:b/>
-          <w:bCs/>
-          <w:i/>
-          <w:iCs/>
-        </w:rPr>
-        <w:t>Each time you run it, it builds a fresh file.</w:t>
-      </w:r>
-      <w:r>
-        <w:rPr>
-          <w:b/>
-          <w:bCs/>
-          <w:i/>
-          <w:iCs/>
-        </w:rPr>
-        <w:t xml:space="preserve"> </w:t>
-      </w:r>
-      <w:r>
-        <w:rPr>
-          <w:b/>
-          <w:bCs/>
-          <w:i/>
-          <w:iCs/>
-        </w:rPr>
-        <w:t>It doesn’t rely on stored data.</w:t>
+        <w:t>System should be stateless: Each time you run it, it builds a fresh file. It doesn’t rely on stored data.</w:t>
       </w:r>
     </w:p>
     <w:p>
@@ -606,14 +543,6 @@
           <w:szCs w:val="12"/>
         </w:rPr>
         <w:br/>
-      </w:r>
-      <w:r>
-        <w:rPr>
-          <w:b/>
-          <w:bCs/>
-          <w:sz w:val="12"/>
-          <w:szCs w:val="12"/>
-        </w:rPr>
         <w:t>time: past_</w:t>
       </w:r>
       <w:r>
@@ -1537,14 +1466,6 @@
           <w:szCs w:val="12"/>
         </w:rPr>
         <w:br/>
-      </w:r>
-      <w:r>
-        <w:rPr>
-          <w:b/>
-          <w:bCs/>
-          <w:sz w:val="12"/>
-          <w:szCs w:val="12"/>
-        </w:rPr>
         <w:t>frequency: annual</w:t>
       </w:r>
       <w:r>
@@ -1726,14 +1647,6 @@
           <w:szCs w:val="12"/>
         </w:rPr>
         <w:br/>
-      </w:r>
-      <w:r>
-        <w:rPr>
-          <w:b/>
-          <w:bCs/>
-          <w:sz w:val="12"/>
-          <w:szCs w:val="12"/>
-        </w:rPr>
         <w:t xml:space="preserve">dataset: </w:t>
       </w:r>
       <w:r>
@@ -2211,25 +2124,16 @@
           <w:sz w:val="12"/>
           <w:szCs w:val="12"/>
         </w:rPr>
-        <w:t xml:space="preserve"> </w:t>
-      </w:r>
-      <w:r>
-        <w:rPr>
-          <w:b/>
-          <w:bCs/>
-          <w:sz w:val="12"/>
-          <w:szCs w:val="12"/>
-        </w:rPr>
-        <w:t>g</w:t>
-      </w:r>
-      <w:r>
-        <w:rPr>
-          <w:b/>
-          <w:bCs/>
-          <w:sz w:val="12"/>
-          <w:szCs w:val="12"/>
-        </w:rPr>
-        <w:t>ross</w:t>
+        <w:t xml:space="preserve"> h</w:t>
+      </w:r>
+      <w:r>
+        <w:rPr>
+          <w:b/>
+          <w:bCs/>
+          <w:sz w:val="12"/>
+          <w:szCs w:val="12"/>
+        </w:rPr>
+        <w:t>ousehold</w:t>
       </w:r>
       <w:r>
         <w:rPr>
@@ -2247,7 +2151,7 @@
           <w:sz w:val="12"/>
           <w:szCs w:val="12"/>
         </w:rPr>
-        <w:t>adjusted</w:t>
+        <w:t>disposable</w:t>
       </w:r>
       <w:r>
         <w:rPr>
@@ -2265,7 +2169,62 @@
           <w:sz w:val="12"/>
           <w:szCs w:val="12"/>
         </w:rPr>
-        <w:t>disposable</w:t>
+        <w:t>income</w:t>
+      </w:r>
+      <w:r>
+        <w:rPr>
+          <w:b/>
+          <w:bCs/>
+          <w:sz w:val="12"/>
+          <w:szCs w:val="12"/>
+        </w:rPr>
+        <w:br/>
+      </w:r>
+      <w:r>
+        <w:rPr>
+          <w:b/>
+          <w:bCs/>
+          <w:sz w:val="12"/>
+          <w:szCs w:val="12"/>
+        </w:rPr>
+        <w:t>s</w:t>
+      </w:r>
+      <w:r>
+        <w:rPr>
+          <w:b/>
+          <w:bCs/>
+          <w:sz w:val="12"/>
+          <w:szCs w:val="12"/>
+        </w:rPr>
+        <w:t>ource:</w:t>
+      </w:r>
+      <w:r>
+        <w:rPr>
+          <w:b/>
+          <w:bCs/>
+          <w:sz w:val="12"/>
+          <w:szCs w:val="12"/>
+        </w:rPr>
+        <w:t xml:space="preserve"> OECD</w:t>
+      </w:r>
+      <w:r>
+        <w:rPr>
+          <w:b/>
+          <w:bCs/>
+          <w:sz w:val="12"/>
+          <w:szCs w:val="12"/>
+        </w:rPr>
+        <w:br/>
+        <w:t>units: usd_</w:t>
+      </w:r>
+      <w:r>
+        <w:rPr>
+          <w:b/>
+          <w:bCs/>
+          <w:sz w:val="12"/>
+          <w:szCs w:val="12"/>
+        </w:rPr>
+        <w:t>dollars</w:t>
       </w:r>
       <w:r>
         <w:rPr>
@@ -2283,7 +2242,7 @@
           <w:sz w:val="12"/>
           <w:szCs w:val="12"/>
         </w:rPr>
-        <w:t>income</w:t>
+        <w:t>per</w:t>
       </w:r>
       <w:r>
         <w:rPr>
@@ -2301,7 +2260,7 @@
           <w:sz w:val="12"/>
           <w:szCs w:val="12"/>
         </w:rPr>
-        <w:t>per</w:t>
+        <w:t>person</w:t>
       </w:r>
       <w:r>
         <w:rPr>
@@ -2319,309 +2278,47 @@
           <w:sz w:val="12"/>
           <w:szCs w:val="12"/>
         </w:rPr>
-        <w:t>capita</w:t>
-      </w:r>
-      <w:r>
-        <w:rPr>
-          <w:b/>
-          <w:bCs/>
-          <w:sz w:val="12"/>
-          <w:szCs w:val="12"/>
-        </w:rPr>
-        <w:t>_</w:t>
-      </w:r>
-      <w:r>
-        <w:rPr>
-          <w:b/>
-          <w:bCs/>
-          <w:sz w:val="12"/>
-          <w:szCs w:val="12"/>
-        </w:rPr>
-        <w:t>of</w:t>
-      </w:r>
-      <w:r>
-        <w:rPr>
-          <w:b/>
-          <w:bCs/>
-          <w:sz w:val="12"/>
-          <w:szCs w:val="12"/>
-        </w:rPr>
-        <w:t>_</w:t>
-      </w:r>
-      <w:r>
-        <w:rPr>
-          <w:b/>
-          <w:bCs/>
-          <w:sz w:val="12"/>
-          <w:szCs w:val="12"/>
-        </w:rPr>
-        <w:t>households</w:t>
-      </w:r>
-      <w:r>
-        <w:rPr>
-          <w:b/>
-          <w:bCs/>
-          <w:sz w:val="12"/>
-          <w:szCs w:val="12"/>
-        </w:rPr>
-        <w:t>_</w:t>
-      </w:r>
-      <w:r>
-        <w:rPr>
-          <w:b/>
-          <w:bCs/>
-          <w:sz w:val="12"/>
-          <w:szCs w:val="12"/>
-        </w:rPr>
-        <w:t>and</w:t>
-      </w:r>
-      <w:r>
-        <w:rPr>
-          <w:b/>
-          <w:bCs/>
-          <w:sz w:val="12"/>
-          <w:szCs w:val="12"/>
-        </w:rPr>
-        <w:t>_</w:t>
-      </w:r>
-      <w:r>
-        <w:rPr>
-          <w:b/>
-          <w:bCs/>
-          <w:sz w:val="12"/>
-          <w:szCs w:val="12"/>
-        </w:rPr>
-        <w:t>NPISH</w:t>
-      </w:r>
-      <w:r>
-        <w:rPr>
-          <w:b/>
-          <w:bCs/>
-          <w:sz w:val="12"/>
-          <w:szCs w:val="12"/>
-        </w:rPr>
-        <w:br/>
-      </w:r>
-      <w:r>
-        <w:rPr>
-          <w:b/>
-          <w:bCs/>
-          <w:sz w:val="12"/>
-          <w:szCs w:val="12"/>
-        </w:rPr>
-        <w:t>s</w:t>
-      </w:r>
-      <w:r>
-        <w:rPr>
-          <w:b/>
-          <w:bCs/>
-          <w:sz w:val="12"/>
-          <w:szCs w:val="12"/>
-        </w:rPr>
-        <w:t>ource:</w:t>
-      </w:r>
-      <w:r>
-        <w:rPr>
-          <w:b/>
-          <w:bCs/>
-          <w:sz w:val="12"/>
-          <w:szCs w:val="12"/>
-        </w:rPr>
-        <w:t xml:space="preserve"> OECD</w:t>
-      </w:r>
-      <w:r>
-        <w:rPr>
-          <w:b/>
-          <w:bCs/>
-          <w:sz w:val="12"/>
-          <w:szCs w:val="12"/>
-        </w:rPr>
-        <w:br/>
-        <w:t xml:space="preserve">units: </w:t>
-      </w:r>
-      <w:r>
-        <w:rPr>
-          <w:b/>
-          <w:bCs/>
-          <w:sz w:val="12"/>
-          <w:szCs w:val="12"/>
-        </w:rPr>
-        <w:t>dollars</w:t>
-      </w:r>
-      <w:r>
-        <w:rPr>
-          <w:b/>
-          <w:bCs/>
-          <w:sz w:val="12"/>
-          <w:szCs w:val="12"/>
-        </w:rPr>
-        <w:t>_</w:t>
-      </w:r>
-      <w:r>
-        <w:rPr>
-          <w:b/>
-          <w:bCs/>
-          <w:sz w:val="12"/>
-          <w:szCs w:val="12"/>
-        </w:rPr>
-        <w:t>per</w:t>
-      </w:r>
-      <w:r>
-        <w:rPr>
-          <w:b/>
-          <w:bCs/>
-          <w:sz w:val="12"/>
-          <w:szCs w:val="12"/>
-        </w:rPr>
-        <w:t>_</w:t>
-      </w:r>
-      <w:r>
-        <w:rPr>
-          <w:b/>
-          <w:bCs/>
-          <w:sz w:val="12"/>
-          <w:szCs w:val="12"/>
-        </w:rPr>
-        <w:t>person</w:t>
-      </w:r>
-      <w:r>
-        <w:rPr>
-          <w:b/>
-          <w:bCs/>
-          <w:sz w:val="12"/>
-          <w:szCs w:val="12"/>
-        </w:rPr>
-        <w:t>_</w:t>
-      </w:r>
-      <w:r>
-        <w:rPr>
-          <w:b/>
-          <w:bCs/>
-          <w:sz w:val="12"/>
-          <w:szCs w:val="12"/>
-        </w:rPr>
         <w:t>PPP</w:t>
       </w:r>
-      <w:r>
-        <w:rPr>
-          <w:b/>
-          <w:bCs/>
-          <w:sz w:val="12"/>
-          <w:szCs w:val="12"/>
-        </w:rPr>
-        <w:t>_</w:t>
-      </w:r>
-      <w:r>
-        <w:rPr>
-          <w:b/>
-          <w:bCs/>
-          <w:sz w:val="12"/>
-          <w:szCs w:val="12"/>
-        </w:rPr>
-        <w:t>converted</w:t>
-      </w:r>
-      <w:r>
-        <w:rPr>
-          <w:b/>
-          <w:bCs/>
-          <w:sz w:val="12"/>
-          <w:szCs w:val="12"/>
-        </w:rPr>
-        <w:t>_c</w:t>
-      </w:r>
-      <w:r>
-        <w:rPr>
-          <w:b/>
-          <w:bCs/>
-          <w:sz w:val="12"/>
-          <w:szCs w:val="12"/>
-        </w:rPr>
-        <w:t>urrent</w:t>
-      </w:r>
-      <w:r>
-        <w:rPr>
-          <w:b/>
-          <w:bCs/>
-          <w:sz w:val="12"/>
-          <w:szCs w:val="12"/>
-        </w:rPr>
-        <w:t>_</w:t>
-      </w:r>
-      <w:r>
-        <w:rPr>
-          <w:b/>
-          <w:bCs/>
-          <w:sz w:val="12"/>
-          <w:szCs w:val="12"/>
-        </w:rPr>
-        <w:t>prices</w:t>
-      </w:r>
-    </w:p>
-    <w:p>
-      <w:pPr>
-        <w:spacing w:after="0" w:line="240" w:lineRule="auto"/>
-        <w:rPr>
-          <w:b/>
-          <w:bCs/>
-          <w:sz w:val="12"/>
-          <w:szCs w:val="12"/>
-        </w:rPr>
-      </w:pPr>
-      <w:r>
-        <w:rPr>
-          <w:b/>
-          <w:bCs/>
-          <w:sz w:val="12"/>
-          <w:szCs w:val="12"/>
-        </w:rPr>
-        <w:t>time: past_</w:t>
-      </w:r>
-      <w:r>
-        <w:rPr>
-          <w:b/>
-          <w:bCs/>
-          <w:sz w:val="12"/>
-          <w:szCs w:val="12"/>
-        </w:rPr>
-        <w:t>10</w:t>
-      </w:r>
-      <w:r>
-        <w:rPr>
-          <w:b/>
-          <w:bCs/>
-          <w:sz w:val="12"/>
-          <w:szCs w:val="12"/>
-        </w:rPr>
-        <w:t>_years</w:t>
-      </w:r>
-    </w:p>
-    <w:p>
-      <w:pPr>
-        <w:spacing w:after="0" w:line="240" w:lineRule="auto"/>
-        <w:rPr>
-          <w:b/>
-          <w:bCs/>
-          <w:sz w:val="12"/>
-          <w:szCs w:val="12"/>
-        </w:rPr>
-      </w:pPr>
-      <w:r>
-        <w:rPr>
-          <w:b/>
-          <w:bCs/>
-          <w:sz w:val="12"/>
-          <w:szCs w:val="12"/>
-        </w:rPr>
-        <w:t xml:space="preserve">frequency: </w:t>
-      </w:r>
-      <w:r>
-        <w:rPr>
-          <w:b/>
-          <w:bCs/>
-          <w:sz w:val="12"/>
-          <w:szCs w:val="12"/>
-        </w:rPr>
-        <w:t>annual</w:t>
+    </w:p>
+    <w:p>
+      <w:pPr>
+        <w:spacing w:after="0" w:line="240" w:lineRule="auto"/>
+        <w:rPr>
+          <w:b/>
+          <w:bCs/>
+          <w:sz w:val="12"/>
+          <w:szCs w:val="12"/>
+        </w:rPr>
+      </w:pPr>
+      <w:r>
+        <w:rPr>
+          <w:b/>
+          <w:bCs/>
+          <w:sz w:val="12"/>
+          <w:szCs w:val="12"/>
+        </w:rPr>
+        <w:t>time: past_10_years</w:t>
+      </w:r>
+    </w:p>
+    <w:p>
+      <w:pPr>
+        <w:spacing w:after="0" w:line="240" w:lineRule="auto"/>
+        <w:rPr>
+          <w:b/>
+          <w:bCs/>
+          <w:sz w:val="12"/>
+          <w:szCs w:val="12"/>
+        </w:rPr>
+      </w:pPr>
+      <w:r>
+        <w:rPr>
+          <w:b/>
+          <w:bCs/>
+          <w:sz w:val="12"/>
+          <w:szCs w:val="12"/>
+        </w:rPr>
+        <w:t>frequency: annual</w:t>
       </w:r>
       <w:r>
         <w:rPr>
@@ -2638,10 +2335,7 @@
       <w:pPr>
         <w:spacing w:after="0" w:line="240" w:lineRule="auto"/>
         <w:rPr>
-          <w:b/>
-          <w:bCs/>
-          <w:sz w:val="12"/>
-          <w:szCs w:val="12"/>
+          <w:rStyle w:val="Hyperlink"/>
         </w:rPr>
       </w:pPr>
       <w:hyperlink r:id="rId12" w:history="1">
@@ -2653,7 +2347,7 @@
             <w:sz w:val="12"/>
             <w:szCs w:val="12"/>
           </w:rPr>
-          <w:t>OECD Data Explorer • NAAG Chapter 5: Households</w:t>
+          <w:t>Household disposable income | OECD</w:t>
         </w:r>
       </w:hyperlink>
     </w:p>
@@ -2769,14 +2463,6 @@
           <w:szCs w:val="12"/>
         </w:rPr>
         <w:br/>
-      </w:r>
-      <w:r>
-        <w:rPr>
-          <w:b/>
-          <w:bCs/>
-          <w:sz w:val="12"/>
-          <w:szCs w:val="12"/>
-        </w:rPr>
         <w:t>n</w:t>
       </w:r>
       <w:r>
@@ -2795,16 +2481,7 @@
           <w:sz w:val="12"/>
           <w:szCs w:val="12"/>
         </w:rPr>
-        <w:t xml:space="preserve"> </w:t>
-      </w:r>
-      <w:r>
-        <w:rPr>
-          <w:b/>
-          <w:bCs/>
-          <w:sz w:val="12"/>
-          <w:szCs w:val="12"/>
-        </w:rPr>
-        <w:t>u</w:t>
+        <w:t xml:space="preserve"> u</w:t>
       </w:r>
       <w:r>
         <w:rPr>
@@ -5023,163 +4700,47 @@
           <w:szCs w:val="12"/>
         </w:rPr>
         <w:br/>
-      </w:r>
-      <w:r>
-        <w:rPr>
-          <w:b/>
-          <w:bCs/>
-          <w:sz w:val="12"/>
-          <w:szCs w:val="12"/>
-        </w:rPr>
-        <w:t>proportion_of_population_aged_</w:t>
-      </w:r>
-      <w:r>
-        <w:rPr>
-          <w:b/>
-          <w:bCs/>
-          <w:sz w:val="12"/>
-          <w:szCs w:val="12"/>
-        </w:rPr>
-        <w:t>15</w:t>
-      </w:r>
-      <w:r>
-        <w:rPr>
-          <w:b/>
-          <w:bCs/>
-          <w:sz w:val="12"/>
-          <w:szCs w:val="12"/>
-        </w:rPr>
-        <w:t>_-_</w:t>
-      </w:r>
-      <w:r>
-        <w:rPr>
-          <w:b/>
-          <w:bCs/>
-          <w:sz w:val="12"/>
-          <w:szCs w:val="12"/>
-        </w:rPr>
-        <w:t>2</w:t>
-      </w:r>
-      <w:r>
-        <w:rPr>
-          <w:b/>
-          <w:bCs/>
-          <w:sz w:val="12"/>
-          <w:szCs w:val="12"/>
-        </w:rPr>
-        <w:t>4_years</w:t>
-      </w:r>
-    </w:p>
-    <w:p>
-      <w:pPr>
-        <w:spacing w:after="0" w:line="240" w:lineRule="auto"/>
-        <w:rPr>
-          <w:b/>
-          <w:bCs/>
-          <w:sz w:val="12"/>
-          <w:szCs w:val="12"/>
-        </w:rPr>
-      </w:pPr>
-      <w:r>
-        <w:rPr>
-          <w:b/>
-          <w:bCs/>
-          <w:sz w:val="12"/>
-          <w:szCs w:val="12"/>
-        </w:rPr>
-        <w:t>proportion_of_population_aged_</w:t>
-      </w:r>
-      <w:r>
-        <w:rPr>
-          <w:b/>
-          <w:bCs/>
-          <w:sz w:val="12"/>
-          <w:szCs w:val="12"/>
-        </w:rPr>
-        <w:t>25</w:t>
-      </w:r>
-      <w:r>
-        <w:rPr>
-          <w:b/>
-          <w:bCs/>
-          <w:sz w:val="12"/>
-          <w:szCs w:val="12"/>
-        </w:rPr>
-        <w:t>_-_4</w:t>
-      </w:r>
-      <w:r>
-        <w:rPr>
-          <w:b/>
-          <w:bCs/>
-          <w:sz w:val="12"/>
-          <w:szCs w:val="12"/>
-        </w:rPr>
-        <w:t>9</w:t>
-      </w:r>
-      <w:r>
-        <w:rPr>
-          <w:b/>
-          <w:bCs/>
-          <w:sz w:val="12"/>
-          <w:szCs w:val="12"/>
-        </w:rPr>
-        <w:t>_years</w:t>
-      </w:r>
-    </w:p>
-    <w:p>
-      <w:pPr>
-        <w:spacing w:after="0" w:line="240" w:lineRule="auto"/>
-        <w:rPr>
-          <w:b/>
-          <w:bCs/>
-          <w:sz w:val="12"/>
-          <w:szCs w:val="12"/>
-        </w:rPr>
-      </w:pPr>
-      <w:r>
-        <w:rPr>
-          <w:b/>
-          <w:bCs/>
-          <w:sz w:val="12"/>
-          <w:szCs w:val="12"/>
-        </w:rPr>
-        <w:t>proportion_of_population_aged_</w:t>
-      </w:r>
-      <w:r>
-        <w:rPr>
-          <w:b/>
-          <w:bCs/>
-          <w:sz w:val="12"/>
-          <w:szCs w:val="12"/>
-        </w:rPr>
-        <w:t>5</w:t>
-      </w:r>
-      <w:r>
-        <w:rPr>
-          <w:b/>
-          <w:bCs/>
-          <w:sz w:val="12"/>
-          <w:szCs w:val="12"/>
-        </w:rPr>
-        <w:t>0_-_</w:t>
-      </w:r>
-      <w:r>
-        <w:rPr>
-          <w:b/>
-          <w:bCs/>
-          <w:sz w:val="12"/>
-          <w:szCs w:val="12"/>
-        </w:rPr>
-        <w:t>6</w:t>
-      </w:r>
-      <w:r>
-        <w:rPr>
-          <w:b/>
-          <w:bCs/>
-          <w:sz w:val="12"/>
-          <w:szCs w:val="12"/>
-        </w:rPr>
-        <w:t>4_years</w:t>
+        <w:t>proportion_of_population_aged_15_-_24_years</w:t>
+      </w:r>
+    </w:p>
+    <w:p>
+      <w:pPr>
+        <w:spacing w:after="0" w:line="240" w:lineRule="auto"/>
+        <w:rPr>
+          <w:b/>
+          <w:bCs/>
+          <w:sz w:val="12"/>
+          <w:szCs w:val="12"/>
+        </w:rPr>
+      </w:pPr>
+      <w:r>
+        <w:rPr>
+          <w:b/>
+          <w:bCs/>
+          <w:sz w:val="12"/>
+          <w:szCs w:val="12"/>
+        </w:rPr>
+        <w:t>proportion_of_population_aged_25_-_49_years</w:t>
+      </w:r>
+    </w:p>
+    <w:p>
+      <w:pPr>
+        <w:spacing w:after="0" w:line="240" w:lineRule="auto"/>
+        <w:rPr>
+          <w:b/>
+          <w:bCs/>
+          <w:sz w:val="12"/>
+          <w:szCs w:val="12"/>
+        </w:rPr>
+      </w:pPr>
+      <w:r>
+        <w:rPr>
+          <w:b/>
+          <w:bCs/>
+          <w:sz w:val="12"/>
+          <w:szCs w:val="12"/>
+        </w:rPr>
+        <w:t>proportion_of_population_aged_50_-_64_years</w:t>
       </w:r>
     </w:p>
     <w:p>
@@ -5431,16 +4992,7 @@
           <w:sz w:val="12"/>
           <w:szCs w:val="12"/>
         </w:rPr>
-        <w:t>2</w:t>
-      </w:r>
-      <w:r>
-        <w:rPr>
-          <w:b/>
-          <w:bCs/>
-          <w:sz w:val="12"/>
-          <w:szCs w:val="12"/>
-        </w:rPr>
-        <w:t>.</w:t>
+        <w:t>2.</w:t>
       </w:r>
     </w:p>
     <w:p>
@@ -5914,16 +5466,7 @@
           <w:sz w:val="12"/>
           <w:szCs w:val="12"/>
         </w:rPr>
-        <w:t>3</w:t>
-      </w:r>
-      <w:r>
-        <w:rPr>
-          <w:b/>
-          <w:bCs/>
-          <w:sz w:val="12"/>
-          <w:szCs w:val="12"/>
-        </w:rPr>
-        <w:t>.</w:t>
+        <w:t>3.</w:t>
       </w:r>
     </w:p>
     <w:p>
@@ -6457,16 +6000,7 @@
           <w:sz w:val="12"/>
           <w:szCs w:val="12"/>
         </w:rPr>
-        <w:t>4</w:t>
-      </w:r>
-      <w:r>
-        <w:rPr>
-          <w:b/>
-          <w:bCs/>
-          <w:sz w:val="12"/>
-          <w:szCs w:val="12"/>
-        </w:rPr>
-        <w:t>.</w:t>
+        <w:t>4.</w:t>
       </w:r>
     </w:p>
     <w:p>
@@ -6949,14 +6483,6 @@
           <w:szCs w:val="12"/>
         </w:rPr>
         <w:br/>
-      </w:r>
-      <w:r>
-        <w:rPr>
-          <w:b/>
-          <w:bCs/>
-          <w:sz w:val="12"/>
-          <w:szCs w:val="12"/>
-        </w:rPr>
         <w:t>indicator:</w:t>
       </w:r>
     </w:p>
@@ -7132,27 +6658,7 @@
             <w:sz w:val="12"/>
             <w:szCs w:val="12"/>
           </w:rPr>
-          <w:t>[proj_stp25] Short-term population projections (20</w:t>
-        </w:r>
-        <w:r>
-          <w:rPr>
-            <w:rStyle w:val="Hyperlink"/>
-            <w:b/>
-            <w:bCs/>
-            <w:sz w:val="12"/>
-            <w:szCs w:val="12"/>
-          </w:rPr>
-          <w:t>2</w:t>
-        </w:r>
-        <w:r>
-          <w:rPr>
-            <w:rStyle w:val="Hyperlink"/>
-            <w:b/>
-            <w:bCs/>
-            <w:sz w:val="12"/>
-            <w:szCs w:val="12"/>
-          </w:rPr>
-          <w:t>4-2050)</w:t>
+          <w:t>[proj_stp25] Short-term population projections (2024-2050)</w:t>
         </w:r>
       </w:hyperlink>
     </w:p>
@@ -9002,27 +8508,7 @@
             <w:sz w:val="12"/>
             <w:szCs w:val="12"/>
           </w:rPr>
-          <w:t>[tour_occ_arnat] Arrivals at tourist accommodation estab</w:t>
-        </w:r>
-        <w:r>
-          <w:rPr>
-            <w:rStyle w:val="Hyperlink"/>
-            <w:b/>
-            <w:bCs/>
-            <w:sz w:val="12"/>
-            <w:szCs w:val="12"/>
-          </w:rPr>
-          <w:t>l</w:t>
-        </w:r>
-        <w:r>
-          <w:rPr>
-            <w:rStyle w:val="Hyperlink"/>
-            <w:b/>
-            <w:bCs/>
-            <w:sz w:val="12"/>
-            <w:szCs w:val="12"/>
-          </w:rPr>
-          <w:t>ishments</w:t>
+          <w:t>[tour_occ_arnat] Arrivals at tourist accommodation establishments</w:t>
         </w:r>
       </w:hyperlink>
     </w:p>
@@ -9517,27 +9003,7 @@
             <w:sz w:val="12"/>
             <w:szCs w:val="12"/>
           </w:rPr>
-          <w:t>[tour_occ_arnraw] Arriva</w:t>
-        </w:r>
-        <w:r>
-          <w:rPr>
-            <w:rStyle w:val="Hyperlink"/>
-            <w:b/>
-            <w:bCs/>
-            <w:sz w:val="12"/>
-            <w:szCs w:val="12"/>
-          </w:rPr>
-          <w:t>l</w:t>
-        </w:r>
-        <w:r>
-          <w:rPr>
-            <w:rStyle w:val="Hyperlink"/>
-            <w:b/>
-            <w:bCs/>
-            <w:sz w:val="12"/>
-            <w:szCs w:val="12"/>
-          </w:rPr>
-          <w:t>s at tourist accommodation establishments by country of origin of the tourist</w:t>
+          <w:t>[tour_occ_arnraw] Arrivals at tourist accommodation establishments by country of origin of the tourist</w:t>
         </w:r>
       </w:hyperlink>
     </w:p>
@@ -9609,178 +9075,7 @@
           <w:sz w:val="12"/>
           <w:szCs w:val="12"/>
         </w:rPr>
-        <w:t>n</w:t>
-      </w:r>
-      <w:r>
-        <w:rPr>
-          <w:b/>
-          <w:bCs/>
-          <w:sz w:val="12"/>
-          <w:szCs w:val="12"/>
-        </w:rPr>
-        <w:t>ights</w:t>
-      </w:r>
-      <w:r>
-        <w:rPr>
-          <w:b/>
-          <w:bCs/>
-          <w:sz w:val="12"/>
-          <w:szCs w:val="12"/>
-        </w:rPr>
-        <w:t>_</w:t>
-      </w:r>
-      <w:r>
-        <w:rPr>
-          <w:b/>
-          <w:bCs/>
-          <w:sz w:val="12"/>
-          <w:szCs w:val="12"/>
-        </w:rPr>
-        <w:t>spent</w:t>
-      </w:r>
-      <w:r>
-        <w:rPr>
-          <w:b/>
-          <w:bCs/>
-          <w:sz w:val="12"/>
-          <w:szCs w:val="12"/>
-        </w:rPr>
-        <w:t>_</w:t>
-      </w:r>
-      <w:r>
-        <w:rPr>
-          <w:b/>
-          <w:bCs/>
-          <w:sz w:val="12"/>
-          <w:szCs w:val="12"/>
-        </w:rPr>
-        <w:t>at</w:t>
-      </w:r>
-      <w:r>
-        <w:rPr>
-          <w:b/>
-          <w:bCs/>
-          <w:sz w:val="12"/>
-          <w:szCs w:val="12"/>
-        </w:rPr>
-        <w:t>_</w:t>
-      </w:r>
-      <w:r>
-        <w:rPr>
-          <w:b/>
-          <w:bCs/>
-          <w:sz w:val="12"/>
-          <w:szCs w:val="12"/>
-        </w:rPr>
-        <w:t>tourist</w:t>
-      </w:r>
-      <w:r>
-        <w:rPr>
-          <w:b/>
-          <w:bCs/>
-          <w:sz w:val="12"/>
-          <w:szCs w:val="12"/>
-        </w:rPr>
-        <w:t>_</w:t>
-      </w:r>
-      <w:r>
-        <w:rPr>
-          <w:b/>
-          <w:bCs/>
-          <w:sz w:val="12"/>
-          <w:szCs w:val="12"/>
-        </w:rPr>
-        <w:t>accommodation</w:t>
-      </w:r>
-      <w:r>
-        <w:rPr>
-          <w:b/>
-          <w:bCs/>
-          <w:sz w:val="12"/>
-          <w:szCs w:val="12"/>
-        </w:rPr>
-        <w:t>_</w:t>
-      </w:r>
-      <w:r>
-        <w:rPr>
-          <w:b/>
-          <w:bCs/>
-          <w:sz w:val="12"/>
-          <w:szCs w:val="12"/>
-        </w:rPr>
-        <w:t>establishments</w:t>
-      </w:r>
-      <w:r>
-        <w:rPr>
-          <w:b/>
-          <w:bCs/>
-          <w:sz w:val="12"/>
-          <w:szCs w:val="12"/>
-        </w:rPr>
-        <w:t>_</w:t>
-      </w:r>
-      <w:r>
-        <w:rPr>
-          <w:b/>
-          <w:bCs/>
-          <w:sz w:val="12"/>
-          <w:szCs w:val="12"/>
-        </w:rPr>
-        <w:t>by</w:t>
-      </w:r>
-      <w:r>
-        <w:rPr>
-          <w:b/>
-          <w:bCs/>
-          <w:sz w:val="12"/>
-          <w:szCs w:val="12"/>
-        </w:rPr>
-        <w:t>_</w:t>
-      </w:r>
-      <w:r>
-        <w:rPr>
-          <w:b/>
-          <w:bCs/>
-          <w:sz w:val="12"/>
-          <w:szCs w:val="12"/>
-        </w:rPr>
-        <w:t>residents</w:t>
-      </w:r>
-      <w:r>
-        <w:rPr>
-          <w:b/>
-          <w:bCs/>
-          <w:sz w:val="12"/>
-          <w:szCs w:val="12"/>
-        </w:rPr>
-        <w:t>_</w:t>
-      </w:r>
-      <w:r>
-        <w:rPr>
-          <w:b/>
-          <w:bCs/>
-          <w:sz w:val="12"/>
-          <w:szCs w:val="12"/>
-        </w:rPr>
-        <w:t>/</w:t>
-      </w:r>
-      <w:r>
-        <w:rPr>
-          <w:b/>
-          <w:bCs/>
-          <w:sz w:val="12"/>
-          <w:szCs w:val="12"/>
-        </w:rPr>
-        <w:t>_</w:t>
-      </w:r>
-      <w:r>
-        <w:rPr>
-          <w:b/>
-          <w:bCs/>
-          <w:sz w:val="12"/>
-          <w:szCs w:val="12"/>
-        </w:rPr>
-        <w:t>non</w:t>
+        <w:t>nights_spent_at_tourist_accommodation_establishments_by_residents_/_non</w:t>
       </w:r>
       <w:r>
         <w:rPr>
@@ -10574,27 +9869,7 @@
             <w:sz w:val="12"/>
             <w:szCs w:val="12"/>
           </w:rPr>
-          <w:t>[tour_dem_tntot] Nights spent by duration, purpose and main destina</w:t>
-        </w:r>
-        <w:r>
-          <w:rPr>
-            <w:rStyle w:val="Hyperlink"/>
-            <w:b/>
-            <w:bCs/>
-            <w:sz w:val="12"/>
-            <w:szCs w:val="12"/>
-          </w:rPr>
-          <w:t>t</w:t>
-        </w:r>
-        <w:r>
-          <w:rPr>
-            <w:rStyle w:val="Hyperlink"/>
-            <w:b/>
-            <w:bCs/>
-            <w:sz w:val="12"/>
-            <w:szCs w:val="12"/>
-          </w:rPr>
-          <w:t>ion of the trip</w:t>
+          <w:t>[tour_dem_tntot] Nights spent by duration, purpose and main destination of the trip</w:t>
         </w:r>
       </w:hyperlink>
     </w:p>
@@ -11069,47 +10344,7 @@
             <w:sz w:val="12"/>
             <w:szCs w:val="12"/>
           </w:rPr>
-          <w:t>[tour_dem_tttot] Tr</w:t>
-        </w:r>
-        <w:r>
-          <w:rPr>
-            <w:rStyle w:val="Hyperlink"/>
-            <w:b/>
-            <w:bCs/>
-            <w:sz w:val="12"/>
-            <w:szCs w:val="12"/>
-          </w:rPr>
-          <w:t>i</w:t>
-        </w:r>
-        <w:r>
-          <w:rPr>
-            <w:rStyle w:val="Hyperlink"/>
-            <w:b/>
-            <w:bCs/>
-            <w:sz w:val="12"/>
-            <w:szCs w:val="12"/>
-          </w:rPr>
-          <w:t>ps by durati</w:t>
-        </w:r>
-        <w:r>
-          <w:rPr>
-            <w:rStyle w:val="Hyperlink"/>
-            <w:b/>
-            <w:bCs/>
-            <w:sz w:val="12"/>
-            <w:szCs w:val="12"/>
-          </w:rPr>
-          <w:t>o</w:t>
-        </w:r>
-        <w:r>
-          <w:rPr>
-            <w:rStyle w:val="Hyperlink"/>
-            <w:b/>
-            <w:bCs/>
-            <w:sz w:val="12"/>
-            <w:szCs w:val="12"/>
-          </w:rPr>
-          <w:t>n, purpose and main destination</w:t>
+          <w:t>[tour_dem_tttot] Trips by duration, purpose and main destination</w:t>
         </w:r>
       </w:hyperlink>
     </w:p>
@@ -11696,14 +10931,6 @@
           <w:szCs w:val="12"/>
         </w:rPr>
         <w:br/>
-      </w:r>
-      <w:r>
-        <w:rPr>
-          <w:b/>
-          <w:bCs/>
-          <w:sz w:val="12"/>
-          <w:szCs w:val="12"/>
-        </w:rPr>
         <w:t>indicator: hotels_and_similar_accommodation</w:t>
       </w:r>
     </w:p>
@@ -12073,18 +11300,7 @@
           <w:szCs w:val="20"/>
           <w:u w:val="single"/>
         </w:rPr>
-        <w:t>TOURISM</w:t>
-      </w:r>
-      <w:r>
-        <w:rPr>
-          <w:b/>
-          <w:bCs/>
-          <w:color w:val="FF0000"/>
-          <w:sz w:val="20"/>
-          <w:szCs w:val="20"/>
-          <w:u w:val="single"/>
-        </w:rPr>
-        <w:t xml:space="preserve"> </w:t>
+        <w:t xml:space="preserve">TOURISM </w:t>
       </w:r>
       <w:r>
         <w:rPr>
@@ -20508,6 +19724,7 @@
   <w:style w:type="character" w:default="1" w:styleId="DefaultParagraphFont">
     <w:name w:val="Default Paragraph Font"/>
     <w:uiPriority w:val="1"/>
+    <w:semiHidden/>
     <w:unhideWhenUsed/>
   </w:style>
   <w:style w:type="table" w:default="1" w:styleId="TableNormal">

</xml_diff>